<commit_message>
Rename brand SpareX -> Ceylon Spares (for ceylonspares.lk)
Updates all hard-coded name strings, metadata title, admin headings,
placeholder, seed, README, and the owner guide. Storefront name still reads
from Settings.shopName (change on the live site via Admin -> Settings).
</commit_message>
<xml_diff>
--- a/Owner-Setup-Guide.docx
+++ b/Owner-Setup-Guide.docx
@@ -14,7 +14,7 @@
           <w:sz w:val="52"/>
           <w:szCs w:val="52"/>
         </w:rPr>
-        <w:t xml:space="preserve">SpareX</w:t>
+        <w:t xml:space="preserve">Ceylon Spares</w:t>
       </w:r>
     </w:p>
     <w:p>
@@ -2066,7 +2066,7 @@
         </w:rPr>
         <w:t xml:space="preserve">This is completely optional — the shop works perfectly without it. To turn it on, create a key at </w:t>
       </w:r>
-      <w:hyperlink w:history="1" r:id="rIde8krtvarfjjovddohdmng">
+      <w:hyperlink w:history="1" r:id="rIdekuwhz7930744qwq7llnl">
         <w:r>
           <w:rPr>
             <w:rStyle w:val="Hyperlink"/>
@@ -2187,7 +2187,7 @@
         </w:rPr>
         <w:t xml:space="preserve">Create a free account at </w:t>
       </w:r>
-      <w:hyperlink w:history="1" r:id="rIda3lkpw6ihkvtoykme4znr">
+      <w:hyperlink w:history="1" r:id="rIdwo1p8lkku3m3wyw8ya785">
         <w:r>
           <w:rPr>
             <w:rStyle w:val="Hyperlink"/>
@@ -2827,7 +2827,7 @@
         </w:rPr>
         <w:t xml:space="preserve">Put the project files on </w:t>
       </w:r>
-      <w:hyperlink w:history="1" r:id="rIdvgynnjqhhy7cevj9hwdpy">
+      <w:hyperlink w:history="1" r:id="rIdoyvnueepnqvwn4cdvioig">
         <w:r>
           <w:rPr>
             <w:rStyle w:val="Hyperlink"/>
@@ -2863,7 +2863,7 @@
         </w:rPr>
         <w:t xml:space="preserve">Create a free account at </w:t>
       </w:r>
-      <w:hyperlink w:history="1" r:id="rIdohpejut_frpf04xlyxusw">
+      <w:hyperlink w:history="1" r:id="rIdv89hh8cf9xafaunw8-zre">
         <w:r>
           <w:rPr>
             <w:rStyle w:val="Hyperlink"/>
@@ -4130,7 +4130,7 @@
           <w:sz w:val="20"/>
           <w:szCs w:val="20"/>
         </w:rPr>
-        <w:t xml:space="preserve">SpareX — you're all set. Happy selling!</w:t>
+        <w:t xml:space="preserve">Ceylon Spares — you're all set. Happy selling!</w:t>
       </w:r>
     </w:p>
     <w:sectPr>

</xml_diff>